<commit_message>
TS 6.1-6.4 Kramam Tamil pushed
</commit_message>
<xml_diff>
--- a/TS-Kramam/TS-6.1/TS 6.1 Tamil Krama Paatam Corrections.docx
+++ b/TS-Kramam/TS-6.1/TS 6.1 Tamil Krama Paatam Corrections.docx
@@ -89,10 +89,9 @@
           <w:bCs/>
           <w:sz w:val="32"/>
           <w:szCs w:val="32"/>
-          <w:highlight w:val="red"/>
           <w:u w:val="single"/>
         </w:rPr>
-        <w:t>???</w:t>
+        <w:t>31st Oct 2026</w:t>
       </w:r>
     </w:p>
     <w:p>
@@ -3311,7 +3310,7 @@
               <w:spacing w:before="0" w:line="252" w:lineRule="auto"/>
               <w:ind w:right="297"/>
               <w:rPr>
-                <w:rFonts w:cstheme="minorBidi" w:hint="cs"/>
+                <w:rFonts w:cstheme="minorBidi"/>
                 <w:b/>
                 <w:color w:val="000000"/>
                 <w:sz w:val="28"/>
@@ -3339,18 +3338,7 @@
                 <w:szCs w:val="28"/>
                 <w:lang w:val="en-IN"/>
               </w:rPr>
-              <w:t>4</w:t>
-            </w:r>
-            <w:r>
-              <w:rPr>
-                <w:rFonts w:cs="Arial"/>
-                <w:b/>
-                <w:color w:val="000000"/>
-                <w:sz w:val="28"/>
-                <w:szCs w:val="28"/>
-                <w:lang w:val="en-IN"/>
-              </w:rPr>
-              <w:t xml:space="preserve">, </w:t>
+              <w:t xml:space="preserve">4, </w:t>
             </w:r>
             <w:r>
               <w:rPr>
@@ -3403,18 +3391,7 @@
                 <w:szCs w:val="28"/>
                 <w:lang w:val="it-IT"/>
               </w:rPr>
-              <w:t>5</w:t>
-            </w:r>
-            <w:r>
-              <w:rPr>
-                <w:rFonts w:cs="Arial"/>
-                <w:b/>
-                <w:color w:val="000000"/>
-                <w:sz w:val="28"/>
-                <w:szCs w:val="28"/>
-                <w:lang w:val="it-IT"/>
-              </w:rPr>
-              <w:t>6</w:t>
+              <w:t>56</w:t>
             </w:r>
           </w:p>
         </w:tc>
@@ -3863,10 +3840,7 @@
           <w:lang w:val="it-IT"/>
         </w:rPr>
       </w:pPr>
-    </w:p>
-    <w:p>
-      <w:pPr>
-        <w:jc w:val="center"/>
+      <w:r>
         <w:rPr>
           <w:b/>
           <w:bCs/>
@@ -3875,20 +3849,8 @@
           <w:u w:val="single"/>
           <w:lang w:val="it-IT"/>
         </w:rPr>
-      </w:pPr>
-    </w:p>
-    <w:p>
-      <w:pPr>
-        <w:jc w:val="center"/>
-        <w:rPr>
-          <w:b/>
-          <w:bCs/>
-          <w:sz w:val="32"/>
-          <w:szCs w:val="32"/>
-          <w:u w:val="single"/>
-          <w:lang w:val="it-IT"/>
-        </w:rPr>
-      </w:pPr>
+        <w:t>===============</w:t>
+      </w:r>
     </w:p>
     <w:p>
       <w:pPr>
@@ -4343,6 +4305,54 @@
           <w:u w:val="single"/>
         </w:rPr>
       </w:pPr>
+    </w:p>
+    <w:p>
+      <w:pPr>
+        <w:jc w:val="center"/>
+        <w:rPr>
+          <w:b/>
+          <w:bCs/>
+          <w:sz w:val="32"/>
+          <w:szCs w:val="32"/>
+          <w:u w:val="single"/>
+        </w:rPr>
+      </w:pPr>
+    </w:p>
+    <w:p>
+      <w:pPr>
+        <w:jc w:val="center"/>
+        <w:rPr>
+          <w:b/>
+          <w:bCs/>
+          <w:sz w:val="32"/>
+          <w:szCs w:val="32"/>
+          <w:u w:val="single"/>
+        </w:rPr>
+      </w:pPr>
+    </w:p>
+    <w:p>
+      <w:pPr>
+        <w:jc w:val="center"/>
+        <w:rPr>
+          <w:b/>
+          <w:bCs/>
+          <w:sz w:val="32"/>
+          <w:szCs w:val="32"/>
+          <w:u w:val="single"/>
+        </w:rPr>
+      </w:pPr>
+    </w:p>
+    <w:p>
+      <w:pPr>
+        <w:jc w:val="center"/>
+        <w:rPr>
+          <w:b/>
+          <w:bCs/>
+          <w:sz w:val="32"/>
+          <w:szCs w:val="32"/>
+          <w:u w:val="single"/>
+        </w:rPr>
+      </w:pPr>
       <w:r>
         <w:rPr>
           <w:b/>
@@ -4351,6 +4361,7 @@
           <w:szCs w:val="32"/>
           <w:u w:val="single"/>
         </w:rPr>
+        <w:lastRenderedPageBreak/>
         <w:t xml:space="preserve">TS </w:t>
       </w:r>
       <w:r>
@@ -4508,7 +4519,6 @@
                 <w:sz w:val="32"/>
                 <w:szCs w:val="32"/>
               </w:rPr>
-              <w:lastRenderedPageBreak/>
               <w:t>Section, Paragraph</w:t>
             </w:r>
           </w:p>
@@ -10437,7 +10447,16 @@
           <w:bCs/>
           <w:sz w:val="32"/>
         </w:rPr>
-        <w:t>replaced with</w:t>
+        <w:t xml:space="preserve">replaced </w:t>
+      </w:r>
+      <w:proofErr w:type="gramStart"/>
+      <w:r>
+        <w:rPr>
+          <w:b/>
+          <w:bCs/>
+          <w:sz w:val="32"/>
+        </w:rPr>
+        <w:t>with</w:t>
       </w:r>
       <w:r>
         <w:rPr>
@@ -10459,6 +10478,7 @@
         </w:rPr>
         <w:t>"</w:t>
       </w:r>
+      <w:proofErr w:type="gramEnd"/>
       <w:r>
         <w:rPr>
           <w:rFonts w:ascii="Latha" w:hAnsi="Latha" w:cs="Latha"/>
@@ -10962,6 +10982,7 @@
       <w:pBdr>
         <w:top w:val="single" w:sz="4" w:space="1" w:color="auto"/>
       </w:pBdr>
+      <w:jc w:val="right"/>
       <w:rPr>
         <w:b/>
         <w:bCs/>
@@ -11034,6 +11055,9 @@
     </w:r>
     <w:r>
       <w:tab/>
+    </w:r>
+    <w:r>
+      <w:t xml:space="preserve">            </w:t>
     </w:r>
     <w:r>
       <w:tab/>
@@ -11218,6 +11242,19 @@
         <w:bCs/>
       </w:rPr>
       <w:tab/>
+    </w:r>
+    <w:r>
+      <w:rPr>
+        <w:b/>
+        <w:bCs/>
+      </w:rPr>
+      <w:t xml:space="preserve">                     </w:t>
+    </w:r>
+    <w:r>
+      <w:rPr>
+        <w:b/>
+        <w:bCs/>
+      </w:rPr>
       <w:t xml:space="preserve"> </w:t>
     </w:r>
     <w:r>

</xml_diff>